<commit_message>
Rebuild lab 11 and 12 docx with the mermaid diagram rendered
Co-Authored-By: Claude Opus 5 <noreply@anthropic.com>
</commit_message>
<xml_diff>
--- a/day-2-stateful-storage-and-exposure/lab-12-velero-backup-restore.docx
+++ b/day-2-stateful-storage-and-exposure/lab-12-velero-backup-restore.docx
@@ -784,7 +784,7 @@
       </w:r>
     </w:p>
     <w:bookmarkEnd w:id="12"/>
-    <w:bookmarkStart w:id="13" w:name="the-idea-in-60-seconds"/>
+    <w:bookmarkStart w:id="16" w:name="the-idea-in-60-seconds"/>
     <w:p>
       <w:pPr>
         <w:pStyle w:val="Heading2"/>
@@ -922,349 +922,349 @@
     </w:p>
     <w:p>
       <w:pPr>
-        <w:pStyle w:val="SourceCode"/>
-      </w:pPr>
-      <w:r>
-        <w:rPr>
-          <w:rStyle w:val="VerbatimChar"/>
-        </w:rPr>
-        <w:t xml:space="preserve">flowchart TB</w:t>
-      </w:r>
-      <w:r>
-        <w:br/>
-      </w:r>
-      <w:r>
-        <w:rPr>
-          <w:rStyle w:val="VerbatimChar"/>
-        </w:rPr>
-        <w:t xml:space="preserve">    NS["namespace: shop&lt;br/&gt;Deployment + Service + ConfigMap(data)"] --&gt;|"velero backup create"| VELERO["Velero"]</w:t>
-      </w:r>
-      <w:r>
-        <w:br/>
-      </w:r>
-      <w:r>
-        <w:rPr>
-          <w:rStyle w:val="VerbatimChar"/>
-        </w:rPr>
-        <w:t xml:space="preserve">    VELERO --&gt;|"stores objects (+ volume data)"| MINIO["in-cluster bucket 'velero'&lt;br/&gt;(S3-compatible)"]</w:t>
-      </w:r>
-      <w:r>
-        <w:br/>
-      </w:r>
-      <w:r>
-        <w:rPr>
-          <w:rStyle w:val="VerbatimChar"/>
-        </w:rPr>
-        <w:t xml:space="preserve">    NS -.-&gt;|"kubectl delete namespace shop"| GONE["everything gone"]</w:t>
-      </w:r>
-      <w:r>
-        <w:br/>
-      </w:r>
-      <w:r>
-        <w:rPr>
-          <w:rStyle w:val="VerbatimChar"/>
-        </w:rPr>
-        <w:t xml:space="preserve">    MINIO --&gt;|"velero restore --from-backup"| RESTORED["namespace shop rebuilt&lt;br/&gt;objects + data intact"]</w:t>
-      </w:r>
-    </w:p>
-    <w:p>
-      <w:r>
-        <w:pict>
-          <v:rect style="width:0;height:1.5pt" o:hralign="center" o:hrstd="t" o:hr="t"/>
-        </w:pict>
-      </w:r>
-    </w:p>
-    <w:bookmarkEnd w:id="13"/>
-    <w:bookmarkStart w:id="31" w:name="X10dcb9d6f450261edc9a9044713a260a0d57627"/>
-    <w:p>
-      <w:pPr>
-        <w:pStyle w:val="Heading2"/>
-      </w:pPr>
-      <w:r>
-        <w:t xml:space="preserve">Step 1 — Stand up the backup target (SeaweedFS) and install Velero</w:t>
-      </w:r>
-    </w:p>
-    <w:p>
-      <w:pPr>
-        <w:pStyle w:val="Heading3"/>
-      </w:pPr>
-      <w:bookmarkStart w:id="14" w:name="Xfe7cddb7291a3918dbfee2732b6f3518e289fd7"/>
-      <w:r>
-        <w:t xml:space="preserve">🚨 This lab used MinIO until 2026-09-25. MinIO's public images are gone.</w:t>
-      </w:r>
-      <w:bookmarkEnd w:id="14"/>
-    </w:p>
-    <w:p>
-      <w:pPr>
-        <w:pStyle w:val="BlockText"/>
-      </w:pPr>
-      <w:r>
-        <w:rPr>
-          <w:b/>
-          <w:bCs/>
-        </w:rPr>
-        <w:t xml:space="preserve">Re-verified 2026-09-27 — every MinIO image this lab used now fails to pull:</w:t>
-      </w:r>
-    </w:p>
-    <w:p>
-      <w:pPr>
-        <w:pStyle w:val="SourceCode"/>
-      </w:pPr>
-      <w:r>
-        <w:rPr>
-          <w:rStyle w:val="VerbatimChar"/>
-        </w:rPr>
-        <w:t xml:space="preserve">$ docker pull minio/minio:latest</w:t>
-      </w:r>
-      <w:r>
-        <w:br/>
-      </w:r>
-      <w:r>
-        <w:rPr>
-          <w:rStyle w:val="VerbatimChar"/>
-        </w:rPr>
-        <w:t xml:space="preserve">Error response from daemon: pull access denied for minio/minio, repository does not exist</w:t>
-      </w:r>
-      <w:r>
-        <w:br/>
-      </w:r>
-      <w:r>
-        <w:rPr>
-          <w:rStyle w:val="VerbatimChar"/>
-        </w:rPr>
-        <w:t xml:space="preserve">or may require 'docker login'</w:t>
-      </w:r>
-      <w:r>
-        <w:br/>
-      </w:r>
-      <w:r>
-        <w:br/>
-      </w:r>
-      <w:r>
-        <w:rPr>
-          <w:rStyle w:val="VerbatimChar"/>
-        </w:rPr>
-        <w:t xml:space="preserve">$ docker pull quay.io/minio/minio:RELEASE.2025-09-07T16-13-09Z-cpuv1</w:t>
-      </w:r>
-      <w:r>
-        <w:br/>
-      </w:r>
-      <w:r>
-        <w:rPr>
-          <w:rStyle w:val="VerbatimChar"/>
-        </w:rPr>
-        <w:t xml:space="preserve">... unexpected status from HEAD request to https://quay.io/v2/minio/minio/manifests/...: 401 Unauthorized</w:t>
-      </w:r>
-      <w:r>
-        <w:br/>
-      </w:r>
-      <w:r>
-        <w:br/>
-      </w:r>
-      <w:r>
-        <w:rPr>
-          <w:rStyle w:val="VerbatimChar"/>
-        </w:rPr>
-        <w:t xml:space="preserve">$ docker pull quay.io/minio/mc:RELEASE.2025-08-13T08-35-41Z-cpuv1</w:t>
-      </w:r>
-      <w:r>
-        <w:br/>
-      </w:r>
-      <w:r>
-        <w:rPr>
-          <w:rStyle w:val="VerbatimChar"/>
-        </w:rPr>
-        <w:t xml:space="preserve">... unexpected status from HEAD request to https://quay.io/v2/minio/mc/manifests/...: 401 UNAUTHORIZED</w:t>
-      </w:r>
-    </w:p>
-    <w:p>
-      <w:pPr>
-        <w:pStyle w:val="BlockText"/>
-      </w:pPr>
-      <w:r>
-        <w:t xml:space="preserve">Both the server</w:t>
-      </w:r>
-      <w:r>
-        <w:t xml:space="preserve"> </w:t>
-      </w:r>
-      <w:r>
-        <w:rPr>
-          <w:b/>
-          <w:bCs/>
-        </w:rPr>
-        <w:t xml:space="preserve">and</w:t>
-      </w:r>
-      <w:r>
-        <w:t xml:space="preserve"> </w:t>
-      </w:r>
-      <w:r>
-        <w:t xml:space="preserve">the</w:t>
-      </w:r>
-      <w:r>
-        <w:t xml:space="preserve"> </w:t>
-      </w:r>
-      <w:r>
-        <w:rPr>
-          <w:rStyle w:val="VerbatimChar"/>
-        </w:rPr>
-        <w:t xml:space="preserve">mc</w:t>
-      </w:r>
-      <w:r>
-        <w:t xml:space="preserve"> </w:t>
-      </w:r>
-      <w:r>
-        <w:t xml:space="preserve">client are unavailable, on Docker Hub</w:t>
-      </w:r>
-      <w:r>
-        <w:t xml:space="preserve"> </w:t>
-      </w:r>
-      <w:r>
-        <w:rPr>
-          <w:i/>
-          <w:iCs/>
-        </w:rPr>
-        <w:t xml:space="preserve">and</w:t>
-      </w:r>
-      <w:r>
-        <w:t xml:space="preserve"> </w:t>
-      </w:r>
-      <w:r>
-        <w:t xml:space="preserve">on quay.io, while other</w:t>
-      </w:r>
-      <w:r>
-        <w:t xml:space="preserve"> </w:t>
-      </w:r>
-      <w:r>
-        <w:t xml:space="preserve">registries work normally. MinIO restricted their public images; there is nothing to configure around</w:t>
-      </w:r>
-      <w:r>
-        <w:t xml:space="preserve"> </w:t>
-      </w:r>
-      <w:r>
-        <w:t xml:space="preserve">it.</w:t>
-      </w:r>
-      <w:r>
-        <w:t xml:space="preserve"> </w:t>
-      </w:r>
-      <w:r>
-        <w:rPr>
-          <w:b/>
-          <w:bCs/>
-        </w:rPr>
-        <w:t xml:space="preserve">This step is therefore written for SeaweedFS</w:t>
-      </w:r>
-      <w:r>
-        <w:t xml:space="preserve">, which is verified working below.</w:t>
-      </w:r>
-      <w:r>
-        <w:t xml:space="preserve"> </w:t>
-      </w:r>
-      <w:r>
-        <w:rPr>
-          <w:rStyle w:val="VerbatimChar"/>
-        </w:rPr>
-        <w:t xml:space="preserve">zenko/cloudserver</w:t>
-      </w:r>
-      <w:r>
-        <w:t xml:space="preserve"> </w:t>
-      </w:r>
-      <w:r>
-        <w:t xml:space="preserve">and</w:t>
-      </w:r>
-      <w:r>
-        <w:t xml:space="preserve"> </w:t>
-      </w:r>
-      <w:r>
-        <w:rPr>
-          <w:rStyle w:val="VerbatimChar"/>
-        </w:rPr>
-        <w:t xml:space="preserve">adobe/s3mock</w:t>
-      </w:r>
-      <w:r>
-        <w:t xml:space="preserve"> </w:t>
-      </w:r>
-      <w:r>
-        <w:t xml:space="preserve">also pull if you prefer them.</w:t>
-      </w:r>
-    </w:p>
-    <w:p>
-      <w:pPr>
-        <w:pStyle w:val="BlockText"/>
-      </w:pPr>
-      <w:r>
-        <w:t xml:space="preserve">Everything downstream keeps the</w:t>
-      </w:r>
-      <w:r>
-        <w:t xml:space="preserve"> </w:t>
-      </w:r>
-      <w:r>
-        <w:rPr>
-          <w:b/>
-          <w:bCs/>
-        </w:rPr>
-        <w:t xml:space="preserve">Service name</w:t>
-      </w:r>
-      <w:r>
-        <w:rPr>
-          <w:b/>
-          <w:bCs/>
-        </w:rPr>
-        <w:t xml:space="preserve"> </w:t>
-      </w:r>
-      <w:r>
-        <w:rPr>
-          <w:rStyle w:val="VerbatimChar"/>
-          <w:b/>
-          <w:bCs/>
-        </w:rPr>
-        <w:t xml:space="preserve">minio</w:t>
-      </w:r>
-      <w:r>
-        <w:t xml:space="preserve">, so Steps 2–7, all the</w:t>
-      </w:r>
-      <w:r>
-        <w:t xml:space="preserve"> </w:t>
-      </w:r>
-      <w:r>
-        <w:rPr>
-          <w:rStyle w:val="VerbatimChar"/>
-        </w:rPr>
-        <w:t xml:space="preserve">s3Url</w:t>
-      </w:r>
-      <w:r>
-        <w:t xml:space="preserve"> </w:t>
-      </w:r>
-      <w:r>
-        <w:t xml:space="preserve">values and every</w:t>
-      </w:r>
-      <w:r>
-        <w:t xml:space="preserve"> </w:t>
-      </w:r>
-      <w:r>
-        <w:t xml:space="preserve">command in the rest of the lab are unchanged.</w:t>
-      </w:r>
-    </w:p>
-    <w:p>
-      <w:pPr>
-        <w:pStyle w:val="FirstParagraph"/>
+        <w:pStyle w:val="BodyText"/>
       </w:pPr>
       <w:r>
         <w:drawing>
           <wp:inline>
-            <wp:extent cx="5943600" cy="856418"/>
+            <wp:extent cx="5473700" cy="7899400"/>
             <wp:effectExtent b="0" l="0" r="0" t="0"/>
-            <wp:docPr descr="All three MinIO images fail to pull while SeaweedFS and the AWS CLI succeed" title="" id="16" name="Picture"/>
+            <wp:docPr descr="Architecture diagram" title="" id="14" name="Picture"/>
             <a:graphic>
               <a:graphicData uri="http://schemas.openxmlformats.org/drawingml/2006/picture">
                 <pic:pic>
                   <pic:nvPicPr>
-                    <pic:cNvPr descr="../artifacts/lab-12/screenshots/04-minio-images-unavailable.png" id="17" name="Picture"/>
+                    <pic:cNvPr descr="artifacts/lab-12/diagrams/diagram.png" id="15" name="Picture"/>
                     <pic:cNvPicPr>
                       <a:picLocks noChangeArrowheads="1" noChangeAspect="1"/>
                     </pic:cNvPicPr>
                   </pic:nvPicPr>
                   <pic:blipFill>
-                    <a:blip r:embed="rId15"/>
+                    <a:blip r:embed="rId13"/>
+                    <a:stretch>
+                      <a:fillRect/>
+                    </a:stretch>
+                  </pic:blipFill>
+                  <pic:spPr bwMode="auto">
+                    <a:xfrm>
+                      <a:off x="0" y="0"/>
+                      <a:ext cx="5473700" cy="7899400"/>
+                    </a:xfrm>
+                    <a:prstGeom prst="rect">
+                      <a:avLst/>
+                    </a:prstGeom>
+                    <a:noFill/>
+                    <a:ln w="9525">
+                      <a:noFill/>
+                      <a:headEnd/>
+                      <a:tailEnd/>
+                    </a:ln>
+                  </pic:spPr>
+                </pic:pic>
+              </a:graphicData>
+            </a:graphic>
+          </wp:inline>
+        </w:drawing>
+      </w:r>
+    </w:p>
+    <w:p>
+      <w:r>
+        <w:pict>
+          <v:rect style="width:0;height:1.5pt" o:hralign="center" o:hrstd="t" o:hr="t"/>
+        </w:pict>
+      </w:r>
+    </w:p>
+    <w:bookmarkEnd w:id="16"/>
+    <w:bookmarkStart w:id="34" w:name="X10dcb9d6f450261edc9a9044713a260a0d57627"/>
+    <w:p>
+      <w:pPr>
+        <w:pStyle w:val="Heading2"/>
+      </w:pPr>
+      <w:r>
+        <w:t xml:space="preserve">Step 1 — Stand up the backup target (SeaweedFS) and install Velero</w:t>
+      </w:r>
+    </w:p>
+    <w:p>
+      <w:pPr>
+        <w:pStyle w:val="Heading3"/>
+      </w:pPr>
+      <w:bookmarkStart w:id="17" w:name="Xfe7cddb7291a3918dbfee2732b6f3518e289fd7"/>
+      <w:r>
+        <w:t xml:space="preserve">🚨 This lab used MinIO until 2026-09-25. MinIO's public images are gone.</w:t>
+      </w:r>
+      <w:bookmarkEnd w:id="17"/>
+    </w:p>
+    <w:p>
+      <w:pPr>
+        <w:pStyle w:val="BlockText"/>
+      </w:pPr>
+      <w:r>
+        <w:rPr>
+          <w:b/>
+          <w:bCs/>
+        </w:rPr>
+        <w:t xml:space="preserve">Re-verified 2026-09-27 — every MinIO image this lab used now fails to pull:</w:t>
+      </w:r>
+    </w:p>
+    <w:p>
+      <w:pPr>
+        <w:pStyle w:val="SourceCode"/>
+      </w:pPr>
+      <w:r>
+        <w:rPr>
+          <w:rStyle w:val="VerbatimChar"/>
+        </w:rPr>
+        <w:t xml:space="preserve">$ docker pull minio/minio:latest</w:t>
+      </w:r>
+      <w:r>
+        <w:br/>
+      </w:r>
+      <w:r>
+        <w:rPr>
+          <w:rStyle w:val="VerbatimChar"/>
+        </w:rPr>
+        <w:t xml:space="preserve">Error response from daemon: pull access denied for minio/minio, repository does not exist</w:t>
+      </w:r>
+      <w:r>
+        <w:br/>
+      </w:r>
+      <w:r>
+        <w:rPr>
+          <w:rStyle w:val="VerbatimChar"/>
+        </w:rPr>
+        <w:t xml:space="preserve">or may require 'docker login'</w:t>
+      </w:r>
+      <w:r>
+        <w:br/>
+      </w:r>
+      <w:r>
+        <w:br/>
+      </w:r>
+      <w:r>
+        <w:rPr>
+          <w:rStyle w:val="VerbatimChar"/>
+        </w:rPr>
+        <w:t xml:space="preserve">$ docker pull quay.io/minio/minio:RELEASE.2025-09-07T16-13-09Z-cpuv1</w:t>
+      </w:r>
+      <w:r>
+        <w:br/>
+      </w:r>
+      <w:r>
+        <w:rPr>
+          <w:rStyle w:val="VerbatimChar"/>
+        </w:rPr>
+        <w:t xml:space="preserve">... unexpected status from HEAD request to https://quay.io/v2/minio/minio/manifests/...: 401 Unauthorized</w:t>
+      </w:r>
+      <w:r>
+        <w:br/>
+      </w:r>
+      <w:r>
+        <w:br/>
+      </w:r>
+      <w:r>
+        <w:rPr>
+          <w:rStyle w:val="VerbatimChar"/>
+        </w:rPr>
+        <w:t xml:space="preserve">$ docker pull quay.io/minio/mc:RELEASE.2025-08-13T08-35-41Z-cpuv1</w:t>
+      </w:r>
+      <w:r>
+        <w:br/>
+      </w:r>
+      <w:r>
+        <w:rPr>
+          <w:rStyle w:val="VerbatimChar"/>
+        </w:rPr>
+        <w:t xml:space="preserve">... unexpected status from HEAD request to https://quay.io/v2/minio/mc/manifests/...: 401 UNAUTHORIZED</w:t>
+      </w:r>
+    </w:p>
+    <w:p>
+      <w:pPr>
+        <w:pStyle w:val="BlockText"/>
+      </w:pPr>
+      <w:r>
+        <w:t xml:space="preserve">Both the server</w:t>
+      </w:r>
+      <w:r>
+        <w:t xml:space="preserve"> </w:t>
+      </w:r>
+      <w:r>
+        <w:rPr>
+          <w:b/>
+          <w:bCs/>
+        </w:rPr>
+        <w:t xml:space="preserve">and</w:t>
+      </w:r>
+      <w:r>
+        <w:t xml:space="preserve"> </w:t>
+      </w:r>
+      <w:r>
+        <w:t xml:space="preserve">the</w:t>
+      </w:r>
+      <w:r>
+        <w:t xml:space="preserve"> </w:t>
+      </w:r>
+      <w:r>
+        <w:rPr>
+          <w:rStyle w:val="VerbatimChar"/>
+        </w:rPr>
+        <w:t xml:space="preserve">mc</w:t>
+      </w:r>
+      <w:r>
+        <w:t xml:space="preserve"> </w:t>
+      </w:r>
+      <w:r>
+        <w:t xml:space="preserve">client are unavailable, on Docker Hub</w:t>
+      </w:r>
+      <w:r>
+        <w:t xml:space="preserve"> </w:t>
+      </w:r>
+      <w:r>
+        <w:rPr>
+          <w:i/>
+          <w:iCs/>
+        </w:rPr>
+        <w:t xml:space="preserve">and</w:t>
+      </w:r>
+      <w:r>
+        <w:t xml:space="preserve"> </w:t>
+      </w:r>
+      <w:r>
+        <w:t xml:space="preserve">on quay.io, while other</w:t>
+      </w:r>
+      <w:r>
+        <w:t xml:space="preserve"> </w:t>
+      </w:r>
+      <w:r>
+        <w:t xml:space="preserve">registries work normally. MinIO restricted their public images; there is nothing to configure around</w:t>
+      </w:r>
+      <w:r>
+        <w:t xml:space="preserve"> </w:t>
+      </w:r>
+      <w:r>
+        <w:t xml:space="preserve">it.</w:t>
+      </w:r>
+      <w:r>
+        <w:t xml:space="preserve"> </w:t>
+      </w:r>
+      <w:r>
+        <w:rPr>
+          <w:b/>
+          <w:bCs/>
+        </w:rPr>
+        <w:t xml:space="preserve">This step is therefore written for SeaweedFS</w:t>
+      </w:r>
+      <w:r>
+        <w:t xml:space="preserve">, which is verified working below.</w:t>
+      </w:r>
+      <w:r>
+        <w:t xml:space="preserve"> </w:t>
+      </w:r>
+      <w:r>
+        <w:rPr>
+          <w:rStyle w:val="VerbatimChar"/>
+        </w:rPr>
+        <w:t xml:space="preserve">zenko/cloudserver</w:t>
+      </w:r>
+      <w:r>
+        <w:t xml:space="preserve"> </w:t>
+      </w:r>
+      <w:r>
+        <w:t xml:space="preserve">and</w:t>
+      </w:r>
+      <w:r>
+        <w:t xml:space="preserve"> </w:t>
+      </w:r>
+      <w:r>
+        <w:rPr>
+          <w:rStyle w:val="VerbatimChar"/>
+        </w:rPr>
+        <w:t xml:space="preserve">adobe/s3mock</w:t>
+      </w:r>
+      <w:r>
+        <w:t xml:space="preserve"> </w:t>
+      </w:r>
+      <w:r>
+        <w:t xml:space="preserve">also pull if you prefer them.</w:t>
+      </w:r>
+    </w:p>
+    <w:p>
+      <w:pPr>
+        <w:pStyle w:val="BlockText"/>
+      </w:pPr>
+      <w:r>
+        <w:t xml:space="preserve">Everything downstream keeps the</w:t>
+      </w:r>
+      <w:r>
+        <w:t xml:space="preserve"> </w:t>
+      </w:r>
+      <w:r>
+        <w:rPr>
+          <w:b/>
+          <w:bCs/>
+        </w:rPr>
+        <w:t xml:space="preserve">Service name</w:t>
+      </w:r>
+      <w:r>
+        <w:rPr>
+          <w:b/>
+          <w:bCs/>
+        </w:rPr>
+        <w:t xml:space="preserve"> </w:t>
+      </w:r>
+      <w:r>
+        <w:rPr>
+          <w:rStyle w:val="VerbatimChar"/>
+          <w:b/>
+          <w:bCs/>
+        </w:rPr>
+        <w:t xml:space="preserve">minio</w:t>
+      </w:r>
+      <w:r>
+        <w:t xml:space="preserve">, so Steps 2–7, all the</w:t>
+      </w:r>
+      <w:r>
+        <w:t xml:space="preserve"> </w:t>
+      </w:r>
+      <w:r>
+        <w:rPr>
+          <w:rStyle w:val="VerbatimChar"/>
+        </w:rPr>
+        <w:t xml:space="preserve">s3Url</w:t>
+      </w:r>
+      <w:r>
+        <w:t xml:space="preserve"> </w:t>
+      </w:r>
+      <w:r>
+        <w:t xml:space="preserve">values and every</w:t>
+      </w:r>
+      <w:r>
+        <w:t xml:space="preserve"> </w:t>
+      </w:r>
+      <w:r>
+        <w:t xml:space="preserve">command in the rest of the lab are unchanged.</w:t>
+      </w:r>
+    </w:p>
+    <w:p>
+      <w:pPr>
+        <w:pStyle w:val="FirstParagraph"/>
+      </w:pPr>
+      <w:r>
+        <w:drawing>
+          <wp:inline>
+            <wp:extent cx="5943600" cy="856418"/>
+            <wp:effectExtent b="0" l="0" r="0" t="0"/>
+            <wp:docPr descr="All three MinIO images fail to pull while SeaweedFS and the AWS CLI succeed" title="" id="19" name="Picture"/>
+            <a:graphic>
+              <a:graphicData uri="http://schemas.openxmlformats.org/drawingml/2006/picture">
+                <pic:pic>
+                  <pic:nvPicPr>
+                    <pic:cNvPr descr="../artifacts/lab-12/screenshots/04-minio-images-unavailable.png" id="20" name="Picture"/>
+                    <pic:cNvPicPr>
+                      <a:picLocks noChangeArrowheads="1" noChangeAspect="1"/>
+                    </pic:cNvPicPr>
+                  </pic:nvPicPr>
+                  <pic:blipFill>
+                    <a:blip r:embed="rId18"/>
                     <a:stretch>
                       <a:fillRect/>
                     </a:stretch>
@@ -1475,7 +1475,7 @@
       <w:r>
         <w:t xml:space="preserve"> </w:t>
       </w:r>
-      <w:hyperlink r:id="rId18">
+      <w:hyperlink r:id="rId21">
         <w:r>
           <w:rPr>
             <w:rStyle w:val="VerbatimChar"/>
@@ -3114,18 +3114,18 @@
           <wp:inline>
             <wp:extent cx="5943600" cy="1099566"/>
             <wp:effectExtent b="0" l="0" r="0" t="0"/>
-            <wp:docPr descr="The three Pods up — the SeaweedFS Deployment still named minio, the node-agent and velero itself — and the backup location reporting Available" title="" id="20" name="Picture"/>
+            <wp:docPr descr="The three Pods up — the SeaweedFS Deployment still named minio, the node-agent and velero itself — and the backup location reporting Available" title="" id="23" name="Picture"/>
             <a:graphic>
               <a:graphicData uri="http://schemas.openxmlformats.org/drawingml/2006/picture">
                 <pic:pic>
                   <pic:nvPicPr>
-                    <pic:cNvPr descr="../artifacts/lab-12/screenshots/05-seaweedfs-backup-location-available.png" id="21" name="Picture"/>
+                    <pic:cNvPr descr="../artifacts/lab-12/screenshots/05-seaweedfs-backup-location-available.png" id="24" name="Picture"/>
                     <pic:cNvPicPr>
                       <a:picLocks noChangeArrowheads="1" noChangeAspect="1"/>
                     </pic:cNvPicPr>
                   </pic:nvPicPr>
                   <pic:blipFill>
-                    <a:blip r:embed="rId19"/>
+                    <a:blip r:embed="rId22"/>
                     <a:stretch>
                       <a:fillRect/>
                     </a:stretch>
@@ -3588,18 +3588,18 @@
           <wp:inline>
             <wp:extent cx="5943600" cy="1180615"/>
             <wp:effectExtent b="0" l="0" r="0" t="0"/>
-            <wp:docPr descr="The trap in one view: the backup says Completed with WARNINGS 1, no PodVolumeBackup exists at all, and the only clue is the server log warning that the hostPath volume was skipped" title="" id="23" name="Picture"/>
+            <wp:docPr descr="The trap in one view: the backup says Completed with WARNINGS 1, no PodVolumeBackup exists at all, and the only clue is the server log warning that the hostPath volume was skipped" title="" id="26" name="Picture"/>
             <a:graphic>
               <a:graphicData uri="http://schemas.openxmlformats.org/drawingml/2006/picture">
                 <pic:pic>
                   <pic:nvPicPr>
-                    <pic:cNvPr descr="../artifacts/lab-12/screenshots/06-hostpath-defeats-fs-backup.png" id="24" name="Picture"/>
+                    <pic:cNvPr descr="../artifacts/lab-12/screenshots/06-hostpath-defeats-fs-backup.png" id="27" name="Picture"/>
                     <pic:cNvPicPr>
                       <a:picLocks noChangeArrowheads="1" noChangeAspect="1"/>
                     </pic:cNvPicPr>
                   </pic:nvPicPr>
                   <pic:blipFill>
-                    <a:blip r:embed="rId22"/>
+                    <a:blip r:embed="rId25"/>
                     <a:stretch>
                       <a:fillRect/>
                     </a:stretch>
@@ -3643,18 +3643,18 @@
           <wp:inline>
             <wp:extent cx="5943600" cy="1261664"/>
             <wp:effectExtent b="0" l="0" r="0" t="0"/>
-            <wp:docPr descr="The same workload on a CSI volume: the PV names hostpath.csi.k8s.io, and a PodVolumeBackup completes via kopia" title="" id="26" name="Picture"/>
+            <wp:docPr descr="The same workload on a CSI volume: the PV names hostpath.csi.k8s.io, and a PodVolumeBackup completes via kopia" title="" id="29" name="Picture"/>
             <a:graphic>
               <a:graphicData uri="http://schemas.openxmlformats.org/drawingml/2006/picture">
                 <pic:pic>
                   <pic:nvPicPr>
-                    <pic:cNvPr descr="../artifacts/lab-12/screenshots/07-csi-volume-backed-up-by-kopia.png" id="27" name="Picture"/>
+                    <pic:cNvPr descr="../artifacts/lab-12/screenshots/07-csi-volume-backed-up-by-kopia.png" id="30" name="Picture"/>
                     <pic:cNvPicPr>
                       <a:picLocks noChangeArrowheads="1" noChangeAspect="1"/>
                     </pic:cNvPicPr>
                   </pic:nvPicPr>
                   <pic:blipFill>
-                    <a:blip r:embed="rId25"/>
+                    <a:blip r:embed="rId28"/>
                     <a:stretch>
                       <a:fillRect/>
                     </a:stretch>
@@ -3739,18 +3739,18 @@
           <wp:inline>
             <wp:extent cx="5943600" cy="1666909"/>
             <wp:effectExtent b="0" l="0" r="0" t="0"/>
-            <wp:docPr descr="The restore completed: Deployment, Service and PVC recreated, widget-9000=42.00 read back out of the volume, and a PodVolumeRestore completed via kopia" title="" id="29" name="Picture"/>
+            <wp:docPr descr="The restore completed: Deployment, Service and PVC recreated, widget-9000=42.00 read back out of the volume, and a PodVolumeRestore completed via kopia" title="" id="32" name="Picture"/>
             <a:graphic>
               <a:graphicData uri="http://schemas.openxmlformats.org/drawingml/2006/picture">
                 <pic:pic>
                   <pic:nvPicPr>
-                    <pic:cNvPr descr="../artifacts/lab-12/screenshots/08-namespace-destroyed-and-restored.png" id="30" name="Picture"/>
+                    <pic:cNvPr descr="../artifacts/lab-12/screenshots/08-namespace-destroyed-and-restored.png" id="33" name="Picture"/>
                     <pic:cNvPicPr>
                       <a:picLocks noChangeArrowheads="1" noChangeAspect="1"/>
                     </pic:cNvPicPr>
                   </pic:nvPicPr>
                   <pic:blipFill>
-                    <a:blip r:embed="rId28"/>
+                    <a:blip r:embed="rId31"/>
                     <a:stretch>
                       <a:fillRect/>
                     </a:stretch>
@@ -3951,8 +3951,8 @@
         </w:pict>
       </w:r>
     </w:p>
-    <w:bookmarkEnd w:id="31"/>
-    <w:bookmarkStart w:id="35" w:name="X394a90876ff05cab0890538a839cef5d4006584"/>
+    <w:bookmarkEnd w:id="34"/>
+    <w:bookmarkStart w:id="38" w:name="X394a90876ff05cab0890538a839cef5d4006584"/>
     <w:p>
       <w:pPr>
         <w:pStyle w:val="Heading2"/>
@@ -4302,18 +4302,18 @@
           <wp:inline>
             <wp:extent cx="5943600" cy="4116751"/>
             <wp:effectExtent b="0" l="0" r="0" t="0"/>
-            <wp:docPr descr="Namespace backed up to MinIO — Completed, 16 items" title="" id="33" name="Picture"/>
+            <wp:docPr descr="Namespace backed up to MinIO — Completed, 16 items" title="" id="36" name="Picture"/>
             <a:graphic>
               <a:graphicData uri="http://schemas.openxmlformats.org/drawingml/2006/picture">
                 <pic:pic>
                   <pic:nvPicPr>
-                    <pic:cNvPr descr="../artifacts/lab-12/screenshots/01-backup-completed.png" id="34" name="Picture"/>
+                    <pic:cNvPr descr="../artifacts/lab-12/screenshots/01-backup-completed.png" id="37" name="Picture"/>
                     <pic:cNvPicPr>
                       <a:picLocks noChangeArrowheads="1" noChangeAspect="1"/>
                     </pic:cNvPicPr>
                   </pic:nvPicPr>
                   <pic:blipFill>
-                    <a:blip r:embed="rId32"/>
+                    <a:blip r:embed="rId35"/>
                     <a:stretch>
                       <a:fillRect/>
                     </a:stretch>
@@ -4393,8 +4393,8 @@
         </w:pict>
       </w:r>
     </w:p>
-    <w:bookmarkEnd w:id="35"/>
-    <w:bookmarkStart w:id="39" w:name="step-3--delete-the-entire-namespace"/>
+    <w:bookmarkEnd w:id="38"/>
+    <w:bookmarkStart w:id="42" w:name="step-3--delete-the-entire-namespace"/>
     <w:p>
       <w:pPr>
         <w:pStyle w:val="Heading2"/>
@@ -4537,18 +4537,18 @@
           <wp:inline>
             <wp:extent cx="5943600" cy="4116751"/>
             <wp:effectExtent b="0" l="0" r="0" t="0"/>
-            <wp:docPr descr="Namespace deleted; the backup survives in MinIO" title="" id="37" name="Picture"/>
+            <wp:docPr descr="Namespace deleted; the backup survives in MinIO" title="" id="40" name="Picture"/>
             <a:graphic>
               <a:graphicData uri="http://schemas.openxmlformats.org/drawingml/2006/picture">
                 <pic:pic>
                   <pic:nvPicPr>
-                    <pic:cNvPr descr="../artifacts/lab-12/screenshots/02-namespace-deleted.png" id="38" name="Picture"/>
+                    <pic:cNvPr descr="../artifacts/lab-12/screenshots/02-namespace-deleted.png" id="41" name="Picture"/>
                     <pic:cNvPicPr>
                       <a:picLocks noChangeArrowheads="1" noChangeAspect="1"/>
                     </pic:cNvPicPr>
                   </pic:nvPicPr>
                   <pic:blipFill>
-                    <a:blip r:embed="rId36"/>
+                    <a:blip r:embed="rId39"/>
                     <a:stretch>
                       <a:fillRect/>
                     </a:stretch>
@@ -4600,8 +4600,8 @@
         </w:pict>
       </w:r>
     </w:p>
-    <w:bookmarkEnd w:id="39"/>
-    <w:bookmarkStart w:id="43" w:name="X6595008221642c471d029092037b5de049385b7"/>
+    <w:bookmarkEnd w:id="42"/>
+    <w:bookmarkStart w:id="46" w:name="X6595008221642c471d029092037b5de049385b7"/>
     <w:p>
       <w:pPr>
         <w:pStyle w:val="Heading2"/>
@@ -4857,18 +4857,18 @@
           <wp:inline>
             <wp:extent cx="5943600" cy="4116751"/>
             <wp:effectExtent b="0" l="0" r="0" t="0"/>
-            <wp:docPr descr="Namespace restored — objects and data intact" title="" id="41" name="Picture"/>
+            <wp:docPr descr="Namespace restored — objects and data intact" title="" id="44" name="Picture"/>
             <a:graphic>
               <a:graphicData uri="http://schemas.openxmlformats.org/drawingml/2006/picture">
                 <pic:pic>
                   <pic:nvPicPr>
-                    <pic:cNvPr descr="../artifacts/lab-12/screenshots/03-restored-with-data.png" id="42" name="Picture"/>
+                    <pic:cNvPr descr="../artifacts/lab-12/screenshots/03-restored-with-data.png" id="45" name="Picture"/>
                     <pic:cNvPicPr>
                       <a:picLocks noChangeArrowheads="1" noChangeAspect="1"/>
                     </pic:cNvPicPr>
                   </pic:nvPicPr>
                   <pic:blipFill>
-                    <a:blip r:embed="rId40"/>
+                    <a:blip r:embed="rId43"/>
                     <a:stretch>
                       <a:fillRect/>
                     </a:stretch>
@@ -4936,8 +4936,8 @@
         </w:pict>
       </w:r>
     </w:p>
-    <w:bookmarkEnd w:id="43"/>
-    <w:bookmarkStart w:id="44" w:name="X43666251edc9954c0ec759f0b7441c7727c0dc6"/>
+    <w:bookmarkEnd w:id="46"/>
+    <w:bookmarkStart w:id="47" w:name="X43666251edc9954c0ec759f0b7441c7727c0dc6"/>
     <w:p>
       <w:pPr>
         <w:pStyle w:val="Heading2"/>
@@ -5743,8 +5743,8 @@
         </w:pict>
       </w:r>
     </w:p>
-    <w:bookmarkEnd w:id="44"/>
-    <w:bookmarkStart w:id="45" w:name="X59e93596927517248276eb0452cfbf85e35b38b"/>
+    <w:bookmarkEnd w:id="47"/>
+    <w:bookmarkStart w:id="48" w:name="X59e93596927517248276eb0452cfbf85e35b38b"/>
     <w:p>
       <w:pPr>
         <w:pStyle w:val="Heading2"/>
@@ -6329,8 +6329,8 @@
         </w:pict>
       </w:r>
     </w:p>
-    <w:bookmarkEnd w:id="45"/>
-    <w:bookmarkStart w:id="46" w:name="step-7--clean-up"/>
+    <w:bookmarkEnd w:id="48"/>
+    <w:bookmarkStart w:id="49" w:name="step-7--clean-up"/>
     <w:p>
       <w:pPr>
         <w:pStyle w:val="Heading2"/>
@@ -6426,8 +6426,8 @@
         </w:pict>
       </w:r>
     </w:p>
-    <w:bookmarkEnd w:id="46"/>
-    <w:bookmarkStart w:id="47" w:name="what-you-learned"/>
+    <w:bookmarkEnd w:id="49"/>
+    <w:bookmarkStart w:id="50" w:name="what-you-learned"/>
     <w:p>
       <w:pPr>
         <w:pStyle w:val="Heading2"/>
@@ -7135,8 +7135,8 @@
         </w:tc>
       </w:tr>
     </w:tbl>
-    <w:bookmarkEnd w:id="47"/>
-    <w:bookmarkStart w:id="53" w:name="evidence"/>
+    <w:bookmarkEnd w:id="50"/>
+    <w:bookmarkStart w:id="56" w:name="evidence"/>
     <w:p>
       <w:pPr>
         <w:pStyle w:val="Heading2"/>
@@ -7176,7 +7176,7 @@
       <w:r>
         <w:t xml:space="preserve"> </w:t>
       </w:r>
-      <w:hyperlink r:id="rId18">
+      <w:hyperlink r:id="rId21">
         <w:r>
           <w:rPr>
             <w:rStyle w:val="VerbatimChar"/>
@@ -7201,7 +7201,7 @@
       <w:r>
         <w:t xml:space="preserve"> </w:t>
       </w:r>
-      <w:hyperlink r:id="rId48">
+      <w:hyperlink r:id="rId51">
         <w:r>
           <w:rPr>
             <w:rStyle w:val="VerbatimChar"/>
@@ -7246,7 +7246,7 @@
         <w:t xml:space="preserve">that follows.</w:t>
       </w:r>
     </w:p>
-    <w:bookmarkStart w:id="52" w:name="original-gke-evidence"/>
+    <w:bookmarkStart w:id="55" w:name="original-gke-evidence"/>
     <w:p>
       <w:pPr>
         <w:pStyle w:val="Heading3"/>
@@ -7265,7 +7265,7 @@
       <w:r>
         <w:t xml:space="preserve"> </w:t>
       </w:r>
-      <w:hyperlink r:id="rId49">
+      <w:hyperlink r:id="rId52">
         <w:r>
           <w:rPr>
             <w:rStyle w:val="VerbatimChar"/>
@@ -7282,7 +7282,7 @@
       <w:r>
         <w:t xml:space="preserve"> </w:t>
       </w:r>
-      <w:hyperlink r:id="rId50">
+      <w:hyperlink r:id="rId53">
         <w:r>
           <w:rPr>
             <w:rStyle w:val="VerbatimChar"/>
@@ -7322,7 +7322,7 @@
       <w:r>
         <w:t xml:space="preserve"> </w:t>
       </w:r>
-      <w:hyperlink r:id="rId51">
+      <w:hyperlink r:id="rId54">
         <w:r>
           <w:rPr>
             <w:rStyle w:val="Hyperlink"/>
@@ -7331,8 +7331,8 @@
         </w:r>
       </w:hyperlink>
     </w:p>
-    <w:bookmarkEnd w:id="52"/>
-    <w:bookmarkEnd w:id="53"/>
+    <w:bookmarkEnd w:id="55"/>
+    <w:bookmarkEnd w:id="56"/>
     <w:sectPr>
       <w:pgSz w:h="15840" w:w="12240"/>
       <w:pgMar w:bottom="1440" w:footer="720" w:gutter="0" w:header="720" w:left="1440" w:right="1440" w:top="1440"/>

</xml_diff>